<commit_message>
Revoir les évaluations formatives et les documents AFC et A3P
Questionnaires UV réservés aux sessions débutant dès le 26 octobre 2026, hors SST. Accordéons fermés, interface responsive avec une question à la fois et délai de 45 secondes contrôlé côté serveur. PDF vierges modernisés.

Convention et attestations AFC adaptées des modèles APS. Convocation aérée sans financement, RAN ni logo SSIAP. Trois couleurs pour les attestations A3P et retrait des mentions demandées.

Validation : 60 tests ciblés, parcours navigateur ordinateur/mobile, contrôle visuel des sept documents et de la pagination des 21 questionnaires.
</commit_message>
<xml_diff>
--- a/templates_word/attestationconducteura3p.docx
+++ b/templates_word/attestationconducteura3p.docx
@@ -11,7 +11,7 @@
     <w:p>
       <w:pPr>
         <w:pBdr>
-          <w:bottom w:val="single" w:sz="12" w:space="1" w:color="B58A1C"/>
+          <w:bottom w:val="single" w:sz="12" w:space="1" w:color="2D5B88"/>
         </w:pBdr>
         <w:spacing w:line="240" w:lineRule="auto"/>
       </w:pPr>
@@ -22,7 +22,7 @@
         <w:jc w:val="center"/>
         <w:rPr>
           <w:b/>
-          <w:color w:val="B58A1C"/>
+          <w:color w:val="2D5B88"/>
         </w:rPr>
       </w:pPr>
     </w:p>
@@ -34,7 +34,7 @@
       <w:r>
         <w:rPr>
           <w:b/>
-          <w:color w:val="B58A1C"/>
+          <w:color w:val="2D5B88"/>
         </w:rPr>
         <w:t>ATTESTATION</w:t>
       </w:r>
@@ -156,7 +156,6 @@
                 <w:color w:val="000000" w:themeColor="text1"/>
               </w:rPr>
             </w:pPr>
-            <w:proofErr w:type="gramStart"/>
             <w:r>
               <w:rPr>
                 <w:b/>
@@ -164,116 +163,9 @@
                 <w:sz w:val="24"/>
                 <w:szCs w:val="28"/>
               </w:rPr>
-              <w:t>{{ nom_complet }}</w:t>
+              <w:t xml:space="preserve">{{ nom_complet }}</w:t>
               <w:br/>
-              <w:t>A suivi le module « Conducteur d’autorité » dans le cadre de sa formation Agent de Protection Physique des Personnes (A3P).</w:t>
-            </w:r>
-            <w:proofErr w:type="spellStart"/>
-            <w:r>
-              <w:rPr>
-                <w:b/>
-                <w:color w:val="000000" w:themeColor="text1"/>
-                <w:sz w:val="24"/>
-                <w:szCs w:val="28"/>
-              </w:rPr>
-            </w:r>
-            <w:proofErr w:type="gramEnd"/>
-            <w:r>
-              <w:rPr>
-                <w:b/>
-                <w:color w:val="000000" w:themeColor="text1"/>
-                <w:sz w:val="24"/>
-                <w:szCs w:val="28"/>
-              </w:rPr>
-            </w:r>
-            <w:proofErr w:type="gramStart"/>
-            <w:r>
-              <w:rPr>
-                <w:b/>
-                <w:color w:val="000000" w:themeColor="text1"/>
-                <w:sz w:val="24"/>
-                <w:szCs w:val="28"/>
-              </w:rPr>
-            </w:r>
-            <w:proofErr w:type="spellEnd"/>
-            <w:r>
-              <w:rPr>
-                <w:b/>
-                <w:color w:val="000000" w:themeColor="text1"/>
-                <w:sz w:val="24"/>
-                <w:szCs w:val="28"/>
-              </w:rPr>
-            </w:r>
-            <w:proofErr w:type="gramEnd"/>
-            <w:r>
-              <w:rPr>
-                <w:b/>
-                <w:color w:val="000000" w:themeColor="text1"/>
-                <w:sz w:val="24"/>
-                <w:szCs w:val="28"/>
-              </w:rPr>
-            </w:r>
-            <w:r>
-              <w:rPr>
-                <w:color w:val="000000" w:themeColor="text1"/>
-                <w:sz w:val="24"/>
-                <w:szCs w:val="28"/>
-              </w:rPr>
-            </w:r>
-            <w:r>
-              <w:rPr>
-                <w:color w:val="000000" w:themeColor="text1"/>
-                <w:sz w:val="24"/>
-                <w:szCs w:val="28"/>
-              </w:rPr>
-            </w:r>
-            <w:r>
-              <w:rPr>
-                <w:color w:val="000000" w:themeColor="text1"/>
-                <w:sz w:val="24"/>
-                <w:szCs w:val="28"/>
-              </w:rPr>
-            </w:r>
-            <w:r>
-              <w:rPr>
-                <w:color w:val="000000" w:themeColor="text1"/>
-              </w:rPr>
-            </w:r>
-            <w:proofErr w:type="spellStart"/>
-            <w:r>
-              <w:rPr>
-                <w:color w:val="000000" w:themeColor="text1"/>
-              </w:rPr>
-            </w:r>
-            <w:proofErr w:type="spellEnd"/>
-            <w:r>
-              <w:rPr>
-                <w:color w:val="000000" w:themeColor="text1"/>
-              </w:rPr>
-            </w:r>
-            <w:proofErr w:type="spellStart"/>
-            <w:r>
-              <w:rPr>
-                <w:color w:val="000000" w:themeColor="text1"/>
-              </w:rPr>
-            </w:r>
-            <w:proofErr w:type="spellEnd"/>
-            <w:r>
-              <w:rPr>
-                <w:color w:val="000000" w:themeColor="text1"/>
-              </w:rPr>
-            </w:r>
-            <w:proofErr w:type="gramStart"/>
-            <w:r>
-              <w:rPr>
-                <w:color w:val="000000" w:themeColor="text1"/>
-              </w:rPr>
-            </w:r>
-            <w:proofErr w:type="gramEnd"/>
-            <w:r>
-              <w:rPr>
-                <w:color w:val="000000" w:themeColor="text1"/>
-              </w:rPr>
+              <w:t xml:space="preserve">A suivi le module « Conducteur d’autorité » dans le cadre de sa formation Agent de Protection Physique des Personnes (A3P).</w:t>
             </w:r>
           </w:p>
           <w:tbl>
@@ -300,7 +192,7 @@
                     <w:bottom w:val="single" w:sz="6" w:space="0" w:color="D9DDE3"/>
                     <w:right w:val="single" w:sz="6" w:space="0" w:color="D9DDE3"/>
                   </w:tcBorders>
-                  <w:shd w:val="clear" w:color="auto" w:fill="F7F2E7"/>
+                  <w:shd w:val="clear" w:color="auto" w:fill="EEF3FA"/>
                   <w:vAlign w:val="center"/>
                 </w:tcPr>
                 <w:p>
@@ -314,7 +206,7 @@
                   <w:r>
                     <w:rPr>
                       <w:b/>
-                      <w:color w:val="B58A1C"/>
+                      <w:color w:val="2D5B88"/>
                       <w:sz w:val="20"/>
                       <w:szCs w:val="20"/>
                     </w:rPr>
@@ -394,7 +286,7 @@
                     <w:bottom w:val="single" w:sz="6" w:space="0" w:color="D9DDE3"/>
                     <w:right w:val="single" w:sz="6" w:space="0" w:color="D9DDE3"/>
                   </w:tcBorders>
-                  <w:shd w:val="clear" w:color="auto" w:fill="F7F2E7"/>
+                  <w:shd w:val="clear" w:color="auto" w:fill="EEF3FA"/>
                   <w:vAlign w:val="center"/>
                 </w:tcPr>
                 <w:p>
@@ -408,7 +300,7 @@
                   <w:r>
                     <w:rPr>
                       <w:b/>
-                      <w:color w:val="B58A1C"/>
+                      <w:color w:val="2D5B88"/>
                       <w:sz w:val="20"/>
                       <w:szCs w:val="20"/>
                     </w:rPr>
@@ -417,7 +309,7 @@
                   <w:r>
                     <w:rPr>
                       <w:b/>
-                      <w:color w:val="B58A1C"/>
+                      <w:color w:val="2D5B88"/>
                       <w:sz w:val="20"/>
                       <w:szCs w:val="20"/>
                     </w:rPr>
@@ -505,7 +397,7 @@
                     <w:bottom w:val="single" w:sz="6" w:space="0" w:color="D9DDE3"/>
                     <w:right w:val="single" w:sz="6" w:space="0" w:color="D9DDE3"/>
                   </w:tcBorders>
-                  <w:shd w:val="clear" w:color="auto" w:fill="F7F2E7"/>
+                  <w:shd w:val="clear" w:color="auto" w:fill="EEF3FA"/>
                   <w:vAlign w:val="center"/>
                 </w:tcPr>
                 <w:p>
@@ -519,7 +411,7 @@
                   <w:r>
                     <w:rPr>
                       <w:b/>
-                      <w:color w:val="B58A1C"/>
+                      <w:color w:val="2D5B88"/>
                       <w:sz w:val="20"/>
                       <w:szCs w:val="20"/>
                     </w:rPr>
@@ -593,7 +485,7 @@
                     <w:bottom w:val="single" w:sz="6" w:space="0" w:color="D9DDE3"/>
                     <w:right w:val="single" w:sz="6" w:space="0" w:color="D9DDE3"/>
                   </w:tcBorders>
-                  <w:shd w:val="clear" w:color="auto" w:fill="F7F2E7"/>
+                  <w:shd w:val="clear" w:color="auto" w:fill="EEF3FA"/>
                   <w:vAlign w:val="center"/>
                 </w:tcPr>
                 <w:p>
@@ -607,7 +499,7 @@
                   <w:r>
                     <w:rPr>
                       <w:b/>
-                      <w:color w:val="B58A1C"/>
+                      <w:color w:val="2D5B88"/>
                       <w:sz w:val="20"/>
                       <w:szCs w:val="20"/>
                     </w:rPr>
@@ -660,7 +552,7 @@
                     <w:bottom w:val="single" w:sz="6" w:space="0" w:color="D9DDE3"/>
                     <w:right w:val="single" w:sz="6" w:space="0" w:color="D9DDE3"/>
                   </w:tcBorders>
-                  <w:shd w:val="clear" w:color="auto" w:fill="F7F2E7"/>
+                  <w:shd w:val="clear" w:color="auto" w:fill="EEF3FA"/>
                   <w:vAlign w:val="center"/>
                 </w:tcPr>
                 <w:p>
@@ -674,7 +566,7 @@
                   <w:r>
                     <w:rPr>
                       <w:b/>
-                      <w:color w:val="B58A1C"/>
+                      <w:color w:val="2D5B88"/>
                       <w:sz w:val="20"/>
                       <w:szCs w:val="20"/>
                     </w:rPr>
@@ -806,105 +698,6 @@
                 <w:sz w:val="19"/>
               </w:rPr>
               <w:t xml:space="preserve">. </w:t>
-            </w:r>
-          </w:p>
-          <w:p>
-            <w:pPr>
-              <w:spacing w:before="140" w:after="40" w:line="259" w:lineRule="auto"/>
-              <w:jc w:val="both"/>
-              <w:rPr>
-                <w:i/>
-                <w:color w:val="4B5563"/>
-                <w:sz w:val="19"/>
-              </w:rPr>
-            </w:pPr>
-            <w:r>
-              <w:rPr>
-                <w:i/>
-                <w:color w:val="4B5563"/>
-                <w:sz w:val="19"/>
-              </w:rPr>
-              <w:t>Cette attestation constate le suivi du module. Elle ne remplace pas le permis de conduire ni les autorisations requises pour l’exercice professionnel.</w:t>
-            </w:r>
-            <w:proofErr w:type="spellStart"/>
-            <w:r>
-              <w:rPr>
-                <w:i/>
-                <w:color w:val="4B5563"/>
-                <w:sz w:val="19"/>
-              </w:rPr>
-            </w:r>
-            <w:proofErr w:type="spellEnd"/>
-            <w:r>
-              <w:rPr>
-                <w:i/>
-                <w:color w:val="4B5563"/>
-                <w:sz w:val="19"/>
-              </w:rPr>
-            </w:r>
-            <w:proofErr w:type="spellStart"/>
-            <w:r>
-              <w:rPr>
-                <w:i/>
-                <w:color w:val="4B5563"/>
-                <w:sz w:val="19"/>
-              </w:rPr>
-            </w:r>
-            <w:proofErr w:type="spellEnd"/>
-            <w:r>
-              <w:rPr>
-                <w:i/>
-                <w:color w:val="4B5563"/>
-                <w:sz w:val="19"/>
-              </w:rPr>
-            </w:r>
-            <w:proofErr w:type="spellStart"/>
-            <w:r>
-              <w:rPr>
-                <w:i/>
-                <w:color w:val="4B5563"/>
-                <w:sz w:val="19"/>
-              </w:rPr>
-            </w:r>
-            <w:proofErr w:type="spellEnd"/>
-            <w:r>
-              <w:rPr>
-                <w:i/>
-                <w:color w:val="4B5563"/>
-                <w:sz w:val="19"/>
-              </w:rPr>
-            </w:r>
-            <w:proofErr w:type="spellStart"/>
-            <w:r>
-              <w:rPr>
-                <w:i/>
-                <w:color w:val="4B5563"/>
-                <w:sz w:val="19"/>
-              </w:rPr>
-            </w:r>
-            <w:proofErr w:type="spellEnd"/>
-            <w:r>
-              <w:rPr>
-                <w:i/>
-                <w:color w:val="4B5563"/>
-                <w:sz w:val="19"/>
-              </w:rPr>
-            </w:r>
-            <w:proofErr w:type="spellStart"/>
-            <w:r>
-              <w:rPr>
-                <w:i/>
-                <w:color w:val="4B5563"/>
-                <w:sz w:val="19"/>
-              </w:rPr>
-            </w:r>
-            <w:proofErr w:type="spellEnd"/>
-            <w:r>
-              <w:rPr>
-                <w:i/>
-                <w:color w:val="4B5563"/>
-                <w:sz w:val="19"/>
-              </w:rPr>
             </w:r>
           </w:p>
           <w:p>

</xml_diff>